<commit_message>
Fix remaining double-parenthesis citations, missing period, and table page break
Three more citation constructs produced visible double closing parens:
a bracket citation ending an outer literal-parenthesis clause, a nested
aside citation, and a link+citation combination — all converted to
avoid the collision, in both German and English.

Adds a missing period after a YouTube link in probleme_system.qmd.

Fixes the small "example dataset" table splitting across a page break:
it now renders as a non-breaking, non-floating LaTeX table in the PDF
(format-conditional via content-visible), while HTML/DOCX keep the
original markdown table unchanged.
</commit_message>
<xml_diff>
--- a/docs/Open-Science-DIN-A5.docx
+++ b/docs/Open-Science-DIN-A5.docx
@@ -2624,7 +2624,7 @@
         <w:pStyle w:val="FirstParagraph"/>
       </w:pPr>
       <w:r>
-        <w:t xml:space="preserve">Ob an einem wissenschaftlichen Befund „etwas dran ist”, er also einen Wahrheitsanspruch hat, hängt – neben seiner eigentlichen Art der Etablierung – bei der Replikationsforschung von vielen Faktoren ab. Was waren die Ergebnisse der Replikationsstudie? Wie viele und wie unterschiedliche Studien wurden durchgeführt? Wie sahen die genauen Methoden aus? Was waren die Unterschiede zwischen Replikationen und Originalstudie? Während Einzelstudien immer einen Erkenntnisgewinn liefern (mindestens, ob eine bestimmte Methode praktikabel ist</w:t>
+        <w:t xml:space="preserve">Ob an einem wissenschaftlichen Befund „etwas dran ist”, er also einen Wahrheitsanspruch hat, hängt – neben seiner eigentlichen Art der Etablierung – bei der Replikationsforschung von vielen Faktoren ab. Was waren die Ergebnisse der Replikationsstudie? Wie viele und wie unterschiedliche Studien wurden durchgeführt? Wie sahen die genauen Methoden aus? Was waren die Unterschiede zwischen Replikationen und Originalstudie? Während Einzelstudien immer einen Erkenntnisgewinn liefern, mindestens ob eine bestimmte Methode praktikabel ist</w:t>
       </w:r>
       <w:r>
         <w:t xml:space="preserve"> </w:t>
@@ -2633,7 +2633,7 @@
         <w:t xml:space="preserve">(Sikorski &amp; Andreoletti, 2023)</w:t>
       </w:r>
       <w:r>
-        <w:t xml:space="preserve">), können sie je nach Forschungsgebiet stark variieren</w:t>
+        <w:t xml:space="preserve">, können sie je nach Forschungsgebiet stark variieren</w:t>
       </w:r>
       <w:r>
         <w:t xml:space="preserve"> </w:t>
@@ -6321,6 +6321,9 @@
           <w:t xml:space="preserve">www.youtube.com/watch?v=EqW7vP6dizU</w:t>
         </w:r>
       </w:hyperlink>
+      <w:r>
+        <w:t xml:space="preserve">.</w:t>
+      </w:r>
     </w:p>
     <w:p>
       <w:r>
@@ -8809,19 +8812,16 @@
               <w:t xml:space="preserve">(2018)</w:t>
             </w:r>
             <w:r>
+              <w:t xml:space="preserve">, und darauf aufbauend Sarstedt und Adler</w:t>
+            </w:r>
+            <w:r>
               <w:t xml:space="preserve"> </w:t>
             </w:r>
             <w:r>
-              <w:t xml:space="preserve">(und darauf aufbauend Sarstedt und Adler</w:t>
-            </w:r>
-            <w:r>
-              <w:t xml:space="preserve"> </w:t>
-            </w:r>
-            <w:r>
               <w:t xml:space="preserve">(2023)</w:t>
             </w:r>
             <w:r>
-              <w:t xml:space="preserve">) schlugen selbstironisch bereits Methoden vor, um P-Hacking noch stärker zu erleichtern. Auf dieser Website können Benutzer*innen Zufallszahlen in dem gewünschten Bereich generieren:</w:t>
+              <w:t xml:space="preserve">, schlugen selbstironisch bereits Methoden vor, um P-Hacking noch stärker zu erleichtern. Auf dieser Website können Benutzer*innen Zufallszahlen in dem gewünschten Bereich generieren:</w:t>
             </w:r>
             <w:r>
               <w:t xml:space="preserve"> </w:t>
@@ -21007,16 +21007,16 @@
         </w:r>
       </w:hyperlink>
       <w:r>
-        <w:t xml:space="preserve">,</w:t>
-      </w:r>
-      <w:r>
-        <w:t xml:space="preserve"> </w:t>
-      </w:r>
-      <w:r>
-        <w:t xml:space="preserve">Richardson (2025)</w:t>
-      </w:r>
-      <w:r>
-        <w:t xml:space="preserve">).</w:t>
+        <w:t xml:space="preserve">)</w:t>
+      </w:r>
+      <w:r>
+        <w:t xml:space="preserve"> </w:t>
+      </w:r>
+      <w:r>
+        <w:t xml:space="preserve">(Richardson, 2025)</w:t>
+      </w:r>
+      <w:r>
+        <w:t xml:space="preserve">.</w:t>
       </w:r>
     </w:p>
     <w:bookmarkEnd w:id="429"/>

</xml_diff>

<commit_message>
v9: Kopf-/Fußzeilen-Abstand, Literaturverzeichnis-Kolumnentitel, 4 Abbildungen umgebaut, Tabellenbeschriftung
- Kopf-/Fußzeilen-Ränder um 0,25mm/0,5mm vom Rand weggesetzt
- Kolumnentitel im Literaturverzeichnis zeigt jetzt korrekt "Literaturverzeichnis"/"References"
  (via \@schapter-Patch nach \RedeclareSectionCommand, da KOMAs automark starred chapters ignoriert)
- Bindestrich vor "die Replikationskrise" (S. 44) zu Gedankenstrich korrigiert
- Abbildung 6 (Anreizsystem) komplett neu aufgebaut: vertikaler Stapel statt Reihe
- Abbildung 12 und 24 (Garden of Forking Paths) im Querformat
- Abbildung 17 (Lösungsansätze) im Querformat als 2x2-Raster statt 1x4-Reihe
- Tabellenbeschriftung "Ausgewählte Meta-Analyse- und Replikationsdatenbanken." ergänzt (S. 178)
- Checkliste zum Präregistrieren bricht nicht mehr über zwei Seiten
- Leere Seite nach Abbildung 1 behoben (Trennlinie sitzt wieder auf der Bildseite)

Alle Fixes in DE und EN parallel angewendet.
</commit_message>
<xml_diff>
--- a/docs/Open-Science-DIN-A5.docx
+++ b/docs/Open-Science-DIN-A5.docx
@@ -641,7 +641,7 @@
       <w:r>
         <w:drawing>
           <wp:inline>
-            <wp:extent cx="5334000" cy="4493271"/>
+            <wp:extent cx="4693920" cy="3954078"/>
             <wp:effectExtent b="0" l="0" r="0" t="0"/>
             <wp:docPr descr="Facetten von Open Science." title="" id="29" name="Picture"/>
             <a:graphic>
@@ -662,7 +662,7 @@
                   <pic:spPr bwMode="auto">
                     <a:xfrm>
                       <a:off x="0" y="0"/>
-                      <a:ext cx="5334000" cy="4493271"/>
+                      <a:ext cx="4693920" cy="3954078"/>
                     </a:xfrm>
                     <a:prstGeom prst="rect">
                       <a:avLst/>
@@ -3719,7 +3719,7 @@
         <w:t xml:space="preserve"> </w:t>
       </w:r>
       <w:r>
-        <w:t xml:space="preserve">- die Replikationskrise in der Psychologie. Anomalien sind in diesem Fall die Befunde von</w:t>
+        <w:t xml:space="preserve">– die Replikationskrise in der Psychologie. Anomalien sind in diesem Fall die Befunde von</w:t>
       </w:r>
       <w:r>
         <w:t xml:space="preserve"> </w:t>
@@ -4362,14 +4362,14 @@
             <w:r>
               <w:drawing>
                 <wp:inline>
-                  <wp:extent cx="5334000" cy="1988267"/>
+                  <wp:extent cx="5334000" cy="8334375"/>
                   <wp:effectExtent b="0" l="0" r="0" t="0"/>
                   <wp:docPr descr="" title="" id="86" name="Picture"/>
                   <a:graphic>
                     <a:graphicData uri="http://schemas.openxmlformats.org/drawingml/2006/picture">
                       <pic:pic>
                         <pic:nvPicPr>
-                          <pic:cNvPr descr="images/struktur.jpg" id="87" name="Picture"/>
+                          <pic:cNvPr descr="images/struktur.png" id="87" name="Picture"/>
                           <pic:cNvPicPr>
                             <a:picLocks noChangeArrowheads="1" noChangeAspect="1"/>
                           </pic:cNvPicPr>
@@ -4383,7 +4383,7 @@
                         <pic:spPr bwMode="auto">
                           <a:xfrm>
                             <a:off x="0" y="0"/>
-                            <a:ext cx="5334000" cy="1988267"/>
+                            <a:ext cx="5334000" cy="8334375"/>
                           </a:xfrm>
                           <a:prstGeom prst="rect">
                             <a:avLst/>
@@ -19055,12 +19055,21 @@
         <w:t xml:space="preserve">entstanden, das heißt, eine Gruppe stellt die Infrastruktur der Datenbank bereit und andere Forschende senden ihre Daten dort hin. Das hat den Vorteil, dass die Arbeit geteilt wird und die Beitragenden ihre Daten durch die Veröffentlichung in der Datenbank sichtbarer machen. In der folgenden Tabelle sind einige themenspezifische Datenbanken aufgelistet.</w:t>
       </w:r>
     </w:p>
+    <w:p>
+      <w:pPr>
+        <w:pStyle w:val="TableCaption"/>
+      </w:pPr>
+      <w:r>
+        <w:t xml:space="preserve">Ausgewählte Meta-Analyse- und Replikationsdatenbanken.</w:t>
+      </w:r>
+    </w:p>
     <w:tbl>
       <w:tblPr>
         <w:tblStyle w:val="Table"/>
         <w:tblW w:type="pct" w:w="5000"/>
         <w:tblLayout w:type="fixed"/>
         <w:tblLook w:firstRow="0" w:lastRow="0" w:firstColumn="0" w:lastColumn="0" w:noHBand="0" w:noVBand="0" w:val="0000"/>
+        <w:tblCaption w:val="Ausgewählte Meta-Analyse- und Replikationsdatenbanken."/>
       </w:tblPr>
       <w:tblGrid>
         <w:gridCol w:w="2640"/>
@@ -20802,7 +20811,7 @@
               <w:pStyle w:val="ImageCaption"/>
             </w:pPr>
             <w:r>
-              <w:t xml:space="preserve">Abbildung 10: Trichter-Diagramm (Funnel Plot) für den Zusammenhang zwischen Angst vor Mathematik und Leistung in Mathematik.</w:t>
+              <w:t xml:space="preserve">Abbildung 11: Trichter-Diagramm (Funnel Plot) für den Zusammenhang zwischen Angst vor Mathematik und Leistung in Mathematik.</w:t>
             </w:r>
           </w:p>
           <w:bookmarkEnd w:id="423"/>
@@ -21247,7 +21256,7 @@
               <w:pStyle w:val="ImageCaption"/>
             </w:pPr>
             <w:r>
-              <w:t xml:space="preserve">Abbildung 11: Breite von Konfidenzintervallen je nach Korrelationsgröße für N = 250.</w:t>
+              <w:t xml:space="preserve">Abbildung 12: Breite von Konfidenzintervallen je nach Korrelationsgröße für N = 250.</w:t>
             </w:r>
           </w:p>
           <w:bookmarkEnd w:id="435"/>
@@ -22042,7 +22051,7 @@
               <w:pStyle w:val="ImageCaption"/>
             </w:pPr>
             <w:r>
-              <w:t xml:space="preserve">Abbildung 12: Ergebnisse verschiedener Analysemethoden für einen festen, fiktiven Datensatz.</w:t>
+              <w:t xml:space="preserve">Abbildung 13: Ergebnisse verschiedener Analysemethoden für einen festen, fiktiven Datensatz.</w:t>
             </w:r>
           </w:p>
           <w:bookmarkEnd w:id="457"/>
@@ -24362,7 +24371,7 @@
               <w:pStyle w:val="ImageCaption"/>
             </w:pPr>
             <w:r>
-              <w:t xml:space="preserve">Abbildung 13: Präregistrierung legt den Pfad im Garden of Forking Paths vorab fest.</w:t>
+              <w:t xml:space="preserve">Abbildung 14: Präregistrierung legt den Pfad im Garden of Forking Paths vorab fest.</w:t>
             </w:r>
           </w:p>
           <w:bookmarkEnd w:id="500"/>

</xml_diff>